<commit_message>
Generate resume DOCX and PDF artifacts
</commit_message>
<xml_diff>
--- a/applications/1password/7bbbdf90-partnerships-engineering/Jordan_Newman_1Password_Partnerships_Engineering_Resume.docx
+++ b/applications/1password/7bbbdf90-partnerships-engineering/Jordan_Newman_1Password_Partnerships_Engineering_Resume.docx
@@ -61,7 +61,7 @@
     </w:p>
     <w:p>
       <w:r>
-        <w:t>Senior software engineer and hands-on architect with more than 20 years of experience building backend platforms, secure integrations, reusable infrastructure, and production systems. Delivered enterprise integrations spanning OAuth-based authentication, browser and ticketing workflows, ERP and supplier platforms, cross-database migration, shared libraries, deployment automation, and high-scale internet infrastructure. Combines independent technical ownership with Architecture Team collaboration, clear documentation, security-focused design, and practical judgment about when to create reusable platform capabilities. Current work includes AI-assisted engineering workflows alongside Azure DevOps, Kubernetes, Terraform, CI/CD, and secure software-delivery standards.</w:t>
+        <w:t>Senior software engineer and hands-on architect with more than 20 years of experience building backend platforms, secure integrations, reusable infrastructure, and production systems. Delivered complex integrations across organizational boundaries spanning OAuth-based authentication, browser and ticketing workflows, ERP and third-party supplier platforms, cross-database migration, shared libraries, deployment automation, and high-scale internet infrastructure. Combines end-to-end technical ownership with Architecture Team collaboration, clear documentation, security-focused design, and practical judgment about when to create reusable platform capabilities. Current work includes AI-assisted engineering workflows alongside Azure DevOps, Kubernetes, Terraform, CI/CD, and secure software-delivery standards.</w:t>
       </w:r>
     </w:p>
     <w:p>
@@ -269,7 +269,7 @@
         <w:t xml:space="preserve">• </w:t>
       </w:r>
       <w:r>
-        <w:t>Built ERP integrations and automated workflows spanning SellerCloud, Essendant, supplier SFTP feeds, product catalogs, images, safety data, orders, and MultiValue/Universe data.</w:t>
+        <w:t>Delivered complex integrations across vendor and platform boundaries, including SellerCloud, Essendant, supplier SFTP feeds, product catalogs, images, safety data, orders, and MultiValue/Universe data.</w:t>
       </w:r>
     </w:p>
     <w:p>
@@ -314,7 +314,7 @@
         <w:t xml:space="preserve">• </w:t>
       </w:r>
       <w:r>
-        <w:t>Architected reusable authentication, telemetry, deployment, monitoring, security, and infrastructure-management systems supporting approximately 3,000-4,000 servers across 10 locations.</w:t>
+        <w:t>Held end-to-end architecture and operational responsibility for reusable authentication, telemetry, deployment, monitoring, security, and infrastructure-management systems supporting approximately 3,000-4,000 servers across 10 locations.</w:t>
       </w:r>
     </w:p>
     <w:p>
@@ -359,7 +359,7 @@
         <w:t xml:space="preserve">• </w:t>
       </w:r>
       <w:r>
-        <w:t>Serve as a member of the Architecture Team, collaborating with architects and the architecture lead to evaluate technical needs, make architecture decisions, define engineering standards, and guide platform direction across teams.</w:t>
+        <w:t>Serve as a member of the Architecture Team, collaborating with architects and the architecture lead to evaluate technical needs, make decisions amid evolving requirements, define engineering standards, and guide platform direction across teams.</w:t>
       </w:r>
     </w:p>
     <w:p>

</xml_diff>